<commit_message>
Laboratorio 02: capturas del flujo (Ej. 8, 9 y 10) y Word con evidencias
- Capturas 8, 8b, 9, 9b, 9c (formulario, envio, listado con la cita nueva y el
  aviso) y 10 (repositorio en GitHub).
- base.html: hoja de estilos minima para que las evidencias se lean claras.
- INFORME_Lab02.md: captura 4 como lista para uniformidad.
- GLAB-S02-YBESTARD-2026-02.docx regenerado desde los .md con las 15 capturas
  incrustadas en cada ejercicio.


Co-Authored-By: Lucas Inga <lucas.inga@tecsup.edu.pe>
</commit_message>
<xml_diff>
--- a/GLAB-S02-YBESTARD-2026-02.docx
+++ b/GLAB-S02-YBESTARD-2026-02.docx
@@ -162,12 +162,7 @@
         <w:t>registrar una nueva cita</w:t>
       </w:r>
       <w:r>
-        <w:t>, indicando la mascota,</w:t>
-      </w:r>
-    </w:p>
-    <w:p>
-      <w:r>
-        <w:t>el dueño, el servicio solicitado, la fecha y la hora.</w:t>
+        <w:t>, indicando la mascota, el dueño, el servicio solicitado, la fecha y la hora.</w:t>
       </w:r>
     </w:p>
     <w:p>
@@ -201,12 +196,7 @@
         <w:t>identificar el servicio solicitado</w:t>
       </w:r>
       <w:r>
-        <w:t xml:space="preserve"> para cada</w:t>
-      </w:r>
-    </w:p>
-    <w:p>
-      <w:r>
-        <w:t>cita (consulta, vacunación, cirugía, baño, u otro).</w:t>
+        <w:t xml:space="preserve"> para cada cita (consulta, vacunación, cirugía, baño, u otro).</w:t>
       </w:r>
     </w:p>
     <w:p>
@@ -223,12 +213,7 @@
         <w:t>distinguir el estado de la cita</w:t>
       </w:r>
       <w:r>
-        <w:t xml:space="preserve"> (pendiente,</w:t>
-      </w:r>
-    </w:p>
-    <w:p>
-      <w:r>
-        <w:t>confirmada, atendida) para dar seguimiento.</w:t>
+        <w:t xml:space="preserve"> (pendiente, confirmada, atendida) para dar seguimiento.</w:t>
       </w:r>
     </w:p>
     <w:p>
@@ -245,12 +230,7 @@
         <w:t>ordenar/consultar las citas por fecha y hora</w:t>
       </w:r>
       <w:r>
-        <w:t>,</w:t>
-      </w:r>
-    </w:p>
-    <w:p>
-      <w:r>
-        <w:t>para evitar que dos citas queden en el mismo horario.</w:t>
+        <w:t>, para evitar que dos citas queden en el mismo horario.</w:t>
       </w:r>
     </w:p>
     <w:p>
@@ -258,12 +238,16 @@
         <w:pStyle w:val="ListNumber"/>
       </w:pPr>
       <w:r>
-        <w:t>El sistema debe permitir **identificar al dueño responsable de cada</w:t>
+        <w:t xml:space="preserve">El sistema debe permitir </w:t>
       </w:r>
-    </w:p>
-    <w:p>
       <w:r>
-        <w:t>mascota**, para poder contactarlo ante cualquier cambio o confirmación de la cita.</w:t>
+        <w:rPr>
+          <w:b/>
+        </w:rPr>
+        <w:t>identificar al dueño responsable de cada mascota</w:t>
+      </w:r>
+      <w:r>
+        <w:t>, para poder contactarlo ante cualquier cambio o confirmación de la cita.</w:t>
       </w:r>
     </w:p>
     <w:p>
@@ -305,12 +289,7 @@
         <w:t>ver el detalle completo de una cita</w:t>
       </w:r>
       <w:r>
-        <w:t xml:space="preserve"> al</w:t>
-      </w:r>
-    </w:p>
-    <w:p>
-      <w:r>
-        <w:t>seleccionarla desde el listado.</w:t>
+        <w:t xml:space="preserve"> al seleccionarla desde el listado.</w:t>
       </w:r>
     </w:p>
     <w:p>
@@ -327,12 +306,7 @@
         <w:t>asignar un veterinario responsable</w:t>
       </w:r>
       <w:r>
-        <w:t xml:space="preserve"> a cada</w:t>
-      </w:r>
-    </w:p>
-    <w:p>
-      <w:r>
-        <w:t>cita.</w:t>
+        <w:t xml:space="preserve"> a cada cita.</w:t>
       </w:r>
     </w:p>
     <w:p>
@@ -349,12 +323,7 @@
         <w:t>filtrar las citas por estado</w:t>
       </w:r>
       <w:r>
-        <w:t xml:space="preserve"> (pendiente,</w:t>
-      </w:r>
-    </w:p>
-    <w:p>
-      <w:r>
-        <w:t>confirmada, atendida).</w:t>
+        <w:t xml:space="preserve"> (pendiente, confirmada, atendida).</w:t>
       </w:r>
     </w:p>
     <w:p>
@@ -362,12 +331,16 @@
         <w:pStyle w:val="ListNumber"/>
       </w:pPr>
       <w:r>
-        <w:t>El sistema debe permitir **buscar citas por nombre de mascota o de</w:t>
+        <w:t xml:space="preserve">El sistema debe permitir </w:t>
       </w:r>
-    </w:p>
-    <w:p>
       <w:r>
-        <w:t>dueño**.</w:t>
+        <w:rPr>
+          <w:b/>
+        </w:rPr>
+        <w:t>buscar citas por nombre de mascota o de dueño</w:t>
+      </w:r>
+      <w:r>
+        <w:t>.</w:t>
       </w:r>
     </w:p>
     <w:p>
@@ -384,12 +357,7 @@
         <w:t>ver cuántas citas hay registradas por día</w:t>
       </w:r>
       <w:r>
-        <w:t>,</w:t>
-      </w:r>
-    </w:p>
-    <w:p>
-      <w:r>
-        <w:t>para conocer la carga de la agenda.</w:t>
+        <w:t>, para conocer la carga de la agenda.</w:t>
       </w:r>
     </w:p>
     <w:p>
@@ -997,10 +965,57 @@
         <w:rPr>
           <w:b/>
         </w:rPr>
-        <w:t>Captura:</w:t>
+        <w:t>Capturas:</w:t>
+      </w:r>
+    </w:p>
+    <w:p>
+      <w:r>
+        <w:rPr>
+          <w:b/>
+        </w:rPr>
+        <w:t xml:space="preserve">Captura 4.png — </w:t>
       </w:r>
       <w:r>
-        <w:t xml:space="preserve"> 4.png — la carpeta de la aplicación ya creada y registrada en la configuración del proyecto.</w:t>
+        <w:t>la carpeta de la aplicación ya creada y registrada en la configuración del proyecto.</w:t>
+      </w:r>
+    </w:p>
+    <w:p>
+      <w:pPr>
+        <w:jc w:val="center"/>
+      </w:pPr>
+      <w:r>
+        <w:drawing>
+          <wp:inline xmlns:a="http://schemas.openxmlformats.org/drawingml/2006/main" xmlns:pic="http://schemas.openxmlformats.org/drawingml/2006/picture">
+            <wp:extent cx="5486400" cy="4032888"/>
+            <wp:docPr id="1" name="Picture 1"/>
+            <wp:cNvGraphicFramePr>
+              <a:graphicFrameLocks noChangeAspect="1"/>
+            </wp:cNvGraphicFramePr>
+            <a:graphic>
+              <a:graphicData uri="http://schemas.openxmlformats.org/drawingml/2006/picture">
+                <pic:pic>
+                  <pic:nvPicPr>
+                    <pic:cNvPr id="0" name="4.png"/>
+                    <pic:cNvPicPr/>
+                  </pic:nvPicPr>
+                  <pic:blipFill>
+                    <a:blip r:embed="rId9"/>
+                    <a:stretch>
+                      <a:fillRect/>
+                    </a:stretch>
+                  </pic:blipFill>
+                  <pic:spPr>
+                    <a:xfrm>
+                      <a:off x="0" y="0"/>
+                      <a:ext cx="5486400" cy="4032888"/>
+                    </a:xfrm>
+                    <a:prstGeom prst="rect"/>
+                  </pic:spPr>
+                </pic:pic>
+              </a:graphicData>
+            </a:graphic>
+          </wp:inline>
+        </w:drawing>
       </w:r>
     </w:p>
     <w:p>
@@ -1075,19 +1090,103 @@
       </w:r>
     </w:p>
     <w:p>
-      <w:pPr>
-        <w:pStyle w:val="ListBullet"/>
-      </w:pPr>
       <w:r>
-        <w:t>5.png — el archivo del modelo abierto en el editor.</w:t>
+        <w:rPr>
+          <w:b/>
+        </w:rPr>
+        <w:t xml:space="preserve">Captura 5.png — </w:t>
+      </w:r>
+      <w:r>
+        <w:t>el archivo del modelo abierto en el editor.</w:t>
       </w:r>
     </w:p>
     <w:p>
       <w:pPr>
-        <w:pStyle w:val="ListBullet"/>
+        <w:jc w:val="center"/>
       </w:pPr>
       <w:r>
-        <w:t>5b.png — la terminal mostrando las cinco citas de ejemplo.</w:t>
+        <w:drawing>
+          <wp:inline xmlns:a="http://schemas.openxmlformats.org/drawingml/2006/main" xmlns:pic="http://schemas.openxmlformats.org/drawingml/2006/picture">
+            <wp:extent cx="5486400" cy="3428049"/>
+            <wp:docPr id="2" name="Picture 2"/>
+            <wp:cNvGraphicFramePr>
+              <a:graphicFrameLocks noChangeAspect="1"/>
+            </wp:cNvGraphicFramePr>
+            <a:graphic>
+              <a:graphicData uri="http://schemas.openxmlformats.org/drawingml/2006/picture">
+                <pic:pic>
+                  <pic:nvPicPr>
+                    <pic:cNvPr id="0" name="5.png"/>
+                    <pic:cNvPicPr/>
+                  </pic:nvPicPr>
+                  <pic:blipFill>
+                    <a:blip r:embed="rId10"/>
+                    <a:stretch>
+                      <a:fillRect/>
+                    </a:stretch>
+                  </pic:blipFill>
+                  <pic:spPr>
+                    <a:xfrm>
+                      <a:off x="0" y="0"/>
+                      <a:ext cx="5486400" cy="3428049"/>
+                    </a:xfrm>
+                    <a:prstGeom prst="rect"/>
+                  </pic:spPr>
+                </pic:pic>
+              </a:graphicData>
+            </a:graphic>
+          </wp:inline>
+        </w:drawing>
+      </w:r>
+    </w:p>
+    <w:p>
+      <w:r>
+        <w:rPr>
+          <w:b/>
+        </w:rPr>
+        <w:t xml:space="preserve">Captura 5b.png — </w:t>
+      </w:r>
+      <w:r>
+        <w:t>la terminal mostrando las cinco citas de ejemplo.</w:t>
+      </w:r>
+    </w:p>
+    <w:p>
+      <w:pPr>
+        <w:jc w:val="center"/>
+      </w:pPr>
+      <w:r>
+        <w:drawing>
+          <wp:inline xmlns:a="http://schemas.openxmlformats.org/drawingml/2006/main" xmlns:pic="http://schemas.openxmlformats.org/drawingml/2006/picture">
+            <wp:extent cx="5486400" cy="1282710"/>
+            <wp:docPr id="3" name="Picture 3"/>
+            <wp:cNvGraphicFramePr>
+              <a:graphicFrameLocks noChangeAspect="1"/>
+            </wp:cNvGraphicFramePr>
+            <a:graphic>
+              <a:graphicData uri="http://schemas.openxmlformats.org/drawingml/2006/picture">
+                <pic:pic>
+                  <pic:nvPicPr>
+                    <pic:cNvPr id="0" name="5b.png"/>
+                    <pic:cNvPicPr/>
+                  </pic:nvPicPr>
+                  <pic:blipFill>
+                    <a:blip r:embed="rId11"/>
+                    <a:stretch>
+                      <a:fillRect/>
+                    </a:stretch>
+                  </pic:blipFill>
+                  <pic:spPr>
+                    <a:xfrm>
+                      <a:off x="0" y="0"/>
+                      <a:ext cx="5486400" cy="1282710"/>
+                    </a:xfrm>
+                    <a:prstGeom prst="rect"/>
+                  </pic:spPr>
+                </pic:pic>
+              </a:graphicData>
+            </a:graphic>
+          </wp:inline>
+        </w:drawing>
       </w:r>
     </w:p>
     <w:p>
@@ -1148,35 +1247,203 @@
       </w:r>
     </w:p>
     <w:p>
-      <w:pPr>
-        <w:pStyle w:val="ListBullet"/>
-      </w:pPr>
       <w:r>
-        <w:t>6.png — la vista que arma el listado.</w:t>
+        <w:rPr>
+          <w:b/>
+        </w:rPr>
+        <w:t xml:space="preserve">Captura 6.png — </w:t>
+      </w:r>
+      <w:r>
+        <w:t>la vista que arma el listado.</w:t>
       </w:r>
     </w:p>
     <w:p>
       <w:pPr>
-        <w:pStyle w:val="ListBullet"/>
+        <w:jc w:val="center"/>
       </w:pPr>
       <w:r>
-        <w:t>6b.png — el archivo de rutas de la aplicación.</w:t>
+        <w:drawing>
+          <wp:inline xmlns:a="http://schemas.openxmlformats.org/drawingml/2006/main" xmlns:pic="http://schemas.openxmlformats.org/drawingml/2006/picture">
+            <wp:extent cx="5486400" cy="3428049"/>
+            <wp:docPr id="4" name="Picture 4"/>
+            <wp:cNvGraphicFramePr>
+              <a:graphicFrameLocks noChangeAspect="1"/>
+            </wp:cNvGraphicFramePr>
+            <a:graphic>
+              <a:graphicData uri="http://schemas.openxmlformats.org/drawingml/2006/picture">
+                <pic:pic>
+                  <pic:nvPicPr>
+                    <pic:cNvPr id="0" name="6.png"/>
+                    <pic:cNvPicPr/>
+                  </pic:nvPicPr>
+                  <pic:blipFill>
+                    <a:blip r:embed="rId12"/>
+                    <a:stretch>
+                      <a:fillRect/>
+                    </a:stretch>
+                  </pic:blipFill>
+                  <pic:spPr>
+                    <a:xfrm>
+                      <a:off x="0" y="0"/>
+                      <a:ext cx="5486400" cy="3428049"/>
+                    </a:xfrm>
+                    <a:prstGeom prst="rect"/>
+                  </pic:spPr>
+                </pic:pic>
+              </a:graphicData>
+            </a:graphic>
+          </wp:inline>
+        </w:drawing>
+      </w:r>
+    </w:p>
+    <w:p>
+      <w:r>
+        <w:rPr>
+          <w:b/>
+        </w:rPr>
+        <w:t xml:space="preserve">Captura 6b.png — </w:t>
+      </w:r>
+      <w:r>
+        <w:t>el archivo de rutas de la aplicación.</w:t>
       </w:r>
     </w:p>
     <w:p>
       <w:pPr>
-        <w:pStyle w:val="ListBullet"/>
+        <w:jc w:val="center"/>
       </w:pPr>
       <w:r>
-        <w:t>6c.png — la plantilla que muestra la tabla.</w:t>
+        <w:drawing>
+          <wp:inline xmlns:a="http://schemas.openxmlformats.org/drawingml/2006/main" xmlns:pic="http://schemas.openxmlformats.org/drawingml/2006/picture">
+            <wp:extent cx="5486400" cy="3428049"/>
+            <wp:docPr id="5" name="Picture 5"/>
+            <wp:cNvGraphicFramePr>
+              <a:graphicFrameLocks noChangeAspect="1"/>
+            </wp:cNvGraphicFramePr>
+            <a:graphic>
+              <a:graphicData uri="http://schemas.openxmlformats.org/drawingml/2006/picture">
+                <pic:pic>
+                  <pic:nvPicPr>
+                    <pic:cNvPr id="0" name="6b.png"/>
+                    <pic:cNvPicPr/>
+                  </pic:nvPicPr>
+                  <pic:blipFill>
+                    <a:blip r:embed="rId13"/>
+                    <a:stretch>
+                      <a:fillRect/>
+                    </a:stretch>
+                  </pic:blipFill>
+                  <pic:spPr>
+                    <a:xfrm>
+                      <a:off x="0" y="0"/>
+                      <a:ext cx="5486400" cy="3428049"/>
+                    </a:xfrm>
+                    <a:prstGeom prst="rect"/>
+                  </pic:spPr>
+                </pic:pic>
+              </a:graphicData>
+            </a:graphic>
+          </wp:inline>
+        </w:drawing>
+      </w:r>
+    </w:p>
+    <w:p>
+      <w:r>
+        <w:rPr>
+          <w:b/>
+        </w:rPr>
+        <w:t xml:space="preserve">Captura 6c.png — </w:t>
+      </w:r>
+      <w:r>
+        <w:t>la plantilla que muestra la tabla.</w:t>
       </w:r>
     </w:p>
     <w:p>
       <w:pPr>
-        <w:pStyle w:val="ListBullet"/>
+        <w:jc w:val="center"/>
       </w:pPr>
       <w:r>
-        <w:t>6d.png — el listado ya funcionando en el navegador.</w:t>
+        <w:drawing>
+          <wp:inline xmlns:a="http://schemas.openxmlformats.org/drawingml/2006/main" xmlns:pic="http://schemas.openxmlformats.org/drawingml/2006/picture">
+            <wp:extent cx="5486400" cy="3428049"/>
+            <wp:docPr id="6" name="Picture 6"/>
+            <wp:cNvGraphicFramePr>
+              <a:graphicFrameLocks noChangeAspect="1"/>
+            </wp:cNvGraphicFramePr>
+            <a:graphic>
+              <a:graphicData uri="http://schemas.openxmlformats.org/drawingml/2006/picture">
+                <pic:pic>
+                  <pic:nvPicPr>
+                    <pic:cNvPr id="0" name="6c.png"/>
+                    <pic:cNvPicPr/>
+                  </pic:nvPicPr>
+                  <pic:blipFill>
+                    <a:blip r:embed="rId14"/>
+                    <a:stretch>
+                      <a:fillRect/>
+                    </a:stretch>
+                  </pic:blipFill>
+                  <pic:spPr>
+                    <a:xfrm>
+                      <a:off x="0" y="0"/>
+                      <a:ext cx="5486400" cy="3428049"/>
+                    </a:xfrm>
+                    <a:prstGeom prst="rect"/>
+                  </pic:spPr>
+                </pic:pic>
+              </a:graphicData>
+            </a:graphic>
+          </wp:inline>
+        </w:drawing>
+      </w:r>
+    </w:p>
+    <w:p>
+      <w:r>
+        <w:rPr>
+          <w:b/>
+        </w:rPr>
+        <w:t xml:space="preserve">Captura 6d.png — </w:t>
+      </w:r>
+      <w:r>
+        <w:t>el listado ya funcionando en el navegador.</w:t>
+      </w:r>
+    </w:p>
+    <w:p>
+      <w:pPr>
+        <w:jc w:val="center"/>
+      </w:pPr>
+      <w:r>
+        <w:drawing>
+          <wp:inline xmlns:a="http://schemas.openxmlformats.org/drawingml/2006/main" xmlns:pic="http://schemas.openxmlformats.org/drawingml/2006/picture">
+            <wp:extent cx="5486400" cy="1835253"/>
+            <wp:docPr id="7" name="Picture 7"/>
+            <wp:cNvGraphicFramePr>
+              <a:graphicFrameLocks noChangeAspect="1"/>
+            </wp:cNvGraphicFramePr>
+            <a:graphic>
+              <a:graphicData uri="http://schemas.openxmlformats.org/drawingml/2006/picture">
+                <pic:pic>
+                  <pic:nvPicPr>
+                    <pic:cNvPr id="0" name="6d.png"/>
+                    <pic:cNvPicPr/>
+                  </pic:nvPicPr>
+                  <pic:blipFill>
+                    <a:blip r:embed="rId15"/>
+                    <a:stretch>
+                      <a:fillRect/>
+                    </a:stretch>
+                  </pic:blipFill>
+                  <pic:spPr>
+                    <a:xfrm>
+                      <a:off x="0" y="0"/>
+                      <a:ext cx="5486400" cy="1835253"/>
+                    </a:xfrm>
+                    <a:prstGeom prst="rect"/>
+                  </pic:spPr>
+                </pic:pic>
+              </a:graphicData>
+            </a:graphic>
+          </wp:inline>
+        </w:drawing>
       </w:r>
     </w:p>
     <w:p>
@@ -1613,19 +1880,103 @@
       </w:r>
     </w:p>
     <w:p>
-      <w:pPr>
-        <w:pStyle w:val="ListBullet"/>
-      </w:pPr>
       <w:r>
-        <w:t>7.png — el archivo del formulario abierto en el editor.</w:t>
+        <w:rPr>
+          <w:b/>
+        </w:rPr>
+        <w:t xml:space="preserve">Captura 7.png — </w:t>
+      </w:r>
+      <w:r>
+        <w:t>el archivo del formulario abierto en el editor.</w:t>
       </w:r>
     </w:p>
     <w:p>
       <w:pPr>
-        <w:pStyle w:val="ListBullet"/>
+        <w:jc w:val="center"/>
       </w:pPr>
       <w:r>
-        <w:t>7b.png — la terminal con las pruebas de validación.</w:t>
+        <w:drawing>
+          <wp:inline xmlns:a="http://schemas.openxmlformats.org/drawingml/2006/main" xmlns:pic="http://schemas.openxmlformats.org/drawingml/2006/picture">
+            <wp:extent cx="5486400" cy="3428049"/>
+            <wp:docPr id="8" name="Picture 8"/>
+            <wp:cNvGraphicFramePr>
+              <a:graphicFrameLocks noChangeAspect="1"/>
+            </wp:cNvGraphicFramePr>
+            <a:graphic>
+              <a:graphicData uri="http://schemas.openxmlformats.org/drawingml/2006/picture">
+                <pic:pic>
+                  <pic:nvPicPr>
+                    <pic:cNvPr id="0" name="7.png"/>
+                    <pic:cNvPicPr/>
+                  </pic:nvPicPr>
+                  <pic:blipFill>
+                    <a:blip r:embed="rId16"/>
+                    <a:stretch>
+                      <a:fillRect/>
+                    </a:stretch>
+                  </pic:blipFill>
+                  <pic:spPr>
+                    <a:xfrm>
+                      <a:off x="0" y="0"/>
+                      <a:ext cx="5486400" cy="3428049"/>
+                    </a:xfrm>
+                    <a:prstGeom prst="rect"/>
+                  </pic:spPr>
+                </pic:pic>
+              </a:graphicData>
+            </a:graphic>
+          </wp:inline>
+        </w:drawing>
+      </w:r>
+    </w:p>
+    <w:p>
+      <w:r>
+        <w:rPr>
+          <w:b/>
+        </w:rPr>
+        <w:t xml:space="preserve">Captura 7b.png — </w:t>
+      </w:r>
+      <w:r>
+        <w:t>la terminal con las pruebas de validación.</w:t>
+      </w:r>
+    </w:p>
+    <w:p>
+      <w:pPr>
+        <w:jc w:val="center"/>
+      </w:pPr>
+      <w:r>
+        <w:drawing>
+          <wp:inline xmlns:a="http://schemas.openxmlformats.org/drawingml/2006/main" xmlns:pic="http://schemas.openxmlformats.org/drawingml/2006/picture">
+            <wp:extent cx="5486400" cy="1305214"/>
+            <wp:docPr id="9" name="Picture 9"/>
+            <wp:cNvGraphicFramePr>
+              <a:graphicFrameLocks noChangeAspect="1"/>
+            </wp:cNvGraphicFramePr>
+            <a:graphic>
+              <a:graphicData uri="http://schemas.openxmlformats.org/drawingml/2006/picture">
+                <pic:pic>
+                  <pic:nvPicPr>
+                    <pic:cNvPr id="0" name="7b.png"/>
+                    <pic:cNvPicPr/>
+                  </pic:nvPicPr>
+                  <pic:blipFill>
+                    <a:blip r:embed="rId17"/>
+                    <a:stretch>
+                      <a:fillRect/>
+                    </a:stretch>
+                  </pic:blipFill>
+                  <pic:spPr>
+                    <a:xfrm>
+                      <a:off x="0" y="0"/>
+                      <a:ext cx="5486400" cy="1305214"/>
+                    </a:xfrm>
+                    <a:prstGeom prst="rect"/>
+                  </pic:spPr>
+                </pic:pic>
+              </a:graphicData>
+            </a:graphic>
+          </wp:inline>
+        </w:drawing>
       </w:r>
     </w:p>
     <w:p>
@@ -2028,29 +2379,103 @@
       </w:r>
     </w:p>
     <w:p>
+      <w:r>
+        <w:rPr>
+          <w:b/>
+        </w:rPr>
+        <w:t xml:space="preserve">Captura 8.png — </w:t>
+      </w:r>
+      <w:r>
+        <w:t>el formulario de registro en el navegador, con los datos de una cita nueva ya escritos.</w:t>
+      </w:r>
+    </w:p>
+    <w:p>
       <w:pPr>
-        <w:pStyle w:val="ListBullet"/>
+        <w:jc w:val="center"/>
       </w:pPr>
       <w:r>
-        <w:t>8.png — el formulario de registro en el navegador, con los datos de una cita</w:t>
+        <w:drawing>
+          <wp:inline xmlns:a="http://schemas.openxmlformats.org/drawingml/2006/main" xmlns:pic="http://schemas.openxmlformats.org/drawingml/2006/picture">
+            <wp:extent cx="5486400" cy="3178629"/>
+            <wp:docPr id="10" name="Picture 10"/>
+            <wp:cNvGraphicFramePr>
+              <a:graphicFrameLocks noChangeAspect="1"/>
+            </wp:cNvGraphicFramePr>
+            <a:graphic>
+              <a:graphicData uri="http://schemas.openxmlformats.org/drawingml/2006/picture">
+                <pic:pic>
+                  <pic:nvPicPr>
+                    <pic:cNvPr id="0" name="8.png"/>
+                    <pic:cNvPicPr/>
+                  </pic:nvPicPr>
+                  <pic:blipFill>
+                    <a:blip r:embed="rId18"/>
+                    <a:stretch>
+                      <a:fillRect/>
+                    </a:stretch>
+                  </pic:blipFill>
+                  <pic:spPr>
+                    <a:xfrm>
+                      <a:off x="0" y="0"/>
+                      <a:ext cx="5486400" cy="3178629"/>
+                    </a:xfrm>
+                    <a:prstGeom prst="rect"/>
+                  </pic:spPr>
+                </pic:pic>
+              </a:graphicData>
+            </a:graphic>
+          </wp:inline>
+        </w:drawing>
       </w:r>
     </w:p>
     <w:p>
       <w:r>
-        <w:t>nueva ya escritos.</w:t>
+        <w:rPr>
+          <w:b/>
+        </w:rPr>
+        <w:t xml:space="preserve">Captura 8b.png — </w:t>
+      </w:r>
+      <w:r>
+        <w:t>el listado justo después de guardar, con el aviso de confirmación y la cita recién agregada visible en la tabla.</w:t>
       </w:r>
     </w:p>
     <w:p>
       <w:pPr>
-        <w:pStyle w:val="ListBullet"/>
+        <w:jc w:val="center"/>
       </w:pPr>
       <w:r>
-        <w:t>8b.png — el listado justo después de guardar, con el aviso de confirmación y la</w:t>
-      </w:r>
-    </w:p>
-    <w:p>
-      <w:r>
-        <w:t>cita recién agregada visible en la tabla.</w:t>
+        <w:drawing>
+          <wp:inline xmlns:a="http://schemas.openxmlformats.org/drawingml/2006/main" xmlns:pic="http://schemas.openxmlformats.org/drawingml/2006/picture">
+            <wp:extent cx="5486400" cy="3178629"/>
+            <wp:docPr id="11" name="Picture 11"/>
+            <wp:cNvGraphicFramePr>
+              <a:graphicFrameLocks noChangeAspect="1"/>
+            </wp:cNvGraphicFramePr>
+            <a:graphic>
+              <a:graphicData uri="http://schemas.openxmlformats.org/drawingml/2006/picture">
+                <pic:pic>
+                  <pic:nvPicPr>
+                    <pic:cNvPr id="0" name="8b.png"/>
+                    <pic:cNvPicPr/>
+                  </pic:nvPicPr>
+                  <pic:blipFill>
+                    <a:blip r:embed="rId19"/>
+                    <a:stretch>
+                      <a:fillRect/>
+                    </a:stretch>
+                  </pic:blipFill>
+                  <pic:spPr>
+                    <a:xfrm>
+                      <a:off x="0" y="0"/>
+                      <a:ext cx="5486400" cy="3178629"/>
+                    </a:xfrm>
+                    <a:prstGeom prst="rect"/>
+                  </pic:spPr>
+                </pic:pic>
+              </a:graphicData>
+            </a:graphic>
+          </wp:inline>
+        </w:drawing>
       </w:r>
     </w:p>
     <w:p>
@@ -2473,32 +2898,153 @@
       </w:r>
     </w:p>
     <w:p>
-      <w:pPr>
-        <w:pStyle w:val="ListBullet"/>
-      </w:pPr>
       <w:r>
-        <w:t>9.png — el listado inicial con las cinco citas de ejemplo.</w:t>
+        <w:rPr>
+          <w:b/>
+        </w:rPr>
+        <w:t xml:space="preserve">Captura 9.png — </w:t>
+      </w:r>
+      <w:r>
+        <w:t>el listado inicial con las cinco citas de ejemplo.</w:t>
       </w:r>
     </w:p>
     <w:p>
       <w:pPr>
-        <w:pStyle w:val="ListBullet"/>
+        <w:jc w:val="center"/>
       </w:pPr>
       <w:r>
-        <w:t>9b.png — el formulario de creación con los datos de la cita nueva.</w:t>
+        <w:drawing>
+          <wp:inline xmlns:a="http://schemas.openxmlformats.org/drawingml/2006/main" xmlns:pic="http://schemas.openxmlformats.org/drawingml/2006/picture">
+            <wp:extent cx="5486400" cy="3178629"/>
+            <wp:docPr id="12" name="Picture 12"/>
+            <wp:cNvGraphicFramePr>
+              <a:graphicFrameLocks noChangeAspect="1"/>
+            </wp:cNvGraphicFramePr>
+            <a:graphic>
+              <a:graphicData uri="http://schemas.openxmlformats.org/drawingml/2006/picture">
+                <pic:pic>
+                  <pic:nvPicPr>
+                    <pic:cNvPr id="0" name="9.png"/>
+                    <pic:cNvPicPr/>
+                  </pic:nvPicPr>
+                  <pic:blipFill>
+                    <a:blip r:embed="rId20"/>
+                    <a:stretch>
+                      <a:fillRect/>
+                    </a:stretch>
+                  </pic:blipFill>
+                  <pic:spPr>
+                    <a:xfrm>
+                      <a:off x="0" y="0"/>
+                      <a:ext cx="5486400" cy="3178629"/>
+                    </a:xfrm>
+                    <a:prstGeom prst="rect"/>
+                  </pic:spPr>
+                </pic:pic>
+              </a:graphicData>
+            </a:graphic>
+          </wp:inline>
+        </w:drawing>
+      </w:r>
+    </w:p>
+    <w:p>
+      <w:r>
+        <w:rPr>
+          <w:b/>
+        </w:rPr>
+        <w:t xml:space="preserve">Captura 9b.png — </w:t>
+      </w:r>
+      <w:r>
+        <w:t>el formulario de creación con los datos de la cita nueva.</w:t>
       </w:r>
     </w:p>
     <w:p>
       <w:pPr>
-        <w:pStyle w:val="ListBullet"/>
+        <w:jc w:val="center"/>
       </w:pPr>
       <w:r>
-        <w:t>9c.png — el listado final, con la cita nueva ya reflejada y el aviso de</w:t>
+        <w:drawing>
+          <wp:inline xmlns:a="http://schemas.openxmlformats.org/drawingml/2006/main" xmlns:pic="http://schemas.openxmlformats.org/drawingml/2006/picture">
+            <wp:extent cx="5486400" cy="3178629"/>
+            <wp:docPr id="13" name="Picture 13"/>
+            <wp:cNvGraphicFramePr>
+              <a:graphicFrameLocks noChangeAspect="1"/>
+            </wp:cNvGraphicFramePr>
+            <a:graphic>
+              <a:graphicData uri="http://schemas.openxmlformats.org/drawingml/2006/picture">
+                <pic:pic>
+                  <pic:nvPicPr>
+                    <pic:cNvPr id="0" name="8.png"/>
+                    <pic:cNvPicPr/>
+                  </pic:nvPicPr>
+                  <pic:blipFill>
+                    <a:blip r:embed="rId18"/>
+                    <a:stretch>
+                      <a:fillRect/>
+                    </a:stretch>
+                  </pic:blipFill>
+                  <pic:spPr>
+                    <a:xfrm>
+                      <a:off x="0" y="0"/>
+                      <a:ext cx="5486400" cy="3178629"/>
+                    </a:xfrm>
+                    <a:prstGeom prst="rect"/>
+                  </pic:spPr>
+                </pic:pic>
+              </a:graphicData>
+            </a:graphic>
+          </wp:inline>
+        </w:drawing>
       </w:r>
     </w:p>
     <w:p>
       <w:r>
-        <w:t>confirmación.</w:t>
+        <w:rPr>
+          <w:b/>
+        </w:rPr>
+        <w:t xml:space="preserve">Captura 9c.png — </w:t>
+      </w:r>
+      <w:r>
+        <w:t>el listado final, con la cita nueva ya reflejada y el aviso de confirmación.</w:t>
+      </w:r>
+    </w:p>
+    <w:p>
+      <w:pPr>
+        <w:jc w:val="center"/>
+      </w:pPr>
+      <w:r>
+        <w:drawing>
+          <wp:inline xmlns:a="http://schemas.openxmlformats.org/drawingml/2006/main" xmlns:pic="http://schemas.openxmlformats.org/drawingml/2006/picture">
+            <wp:extent cx="5486400" cy="3178629"/>
+            <wp:docPr id="14" name="Picture 14"/>
+            <wp:cNvGraphicFramePr>
+              <a:graphicFrameLocks noChangeAspect="1"/>
+            </wp:cNvGraphicFramePr>
+            <a:graphic>
+              <a:graphicData uri="http://schemas.openxmlformats.org/drawingml/2006/picture">
+                <pic:pic>
+                  <pic:nvPicPr>
+                    <pic:cNvPr id="0" name="8b.png"/>
+                    <pic:cNvPicPr/>
+                  </pic:nvPicPr>
+                  <pic:blipFill>
+                    <a:blip r:embed="rId19"/>
+                    <a:stretch>
+                      <a:fillRect/>
+                    </a:stretch>
+                  </pic:blipFill>
+                  <pic:spPr>
+                    <a:xfrm>
+                      <a:off x="0" y="0"/>
+                      <a:ext cx="5486400" cy="3178629"/>
+                    </a:xfrm>
+                    <a:prstGeom prst="rect"/>
+                  </pic:spPr>
+                </pic:pic>
+              </a:graphicData>
+            </a:graphic>
+          </wp:inline>
+        </w:drawing>
       </w:r>
     </w:p>
     <w:p>
@@ -3095,16 +3641,53 @@
       </w:r>
     </w:p>
     <w:p>
-      <w:pPr>
-        <w:pStyle w:val="ListBullet"/>
-      </w:pPr>
       <w:r>
-        <w:t>10.png — el repositorio en GitHub con el código de la App y los archivos de</w:t>
+        <w:rPr>
+          <w:b/>
+        </w:rPr>
+        <w:t xml:space="preserve">Captura 10.png — </w:t>
+      </w:r>
+      <w:r>
+        <w:t>el repositorio en GitHub con el código de la App y los archivos de documentación actualizados.</w:t>
       </w:r>
     </w:p>
     <w:p>
+      <w:pPr>
+        <w:jc w:val="center"/>
+      </w:pPr>
       <w:r>
-        <w:t>documentación actualizados.</w:t>
+        <w:drawing>
+          <wp:inline xmlns:a="http://schemas.openxmlformats.org/drawingml/2006/main" xmlns:pic="http://schemas.openxmlformats.org/drawingml/2006/picture">
+            <wp:extent cx="5486400" cy="5884506"/>
+            <wp:docPr id="15" name="Picture 15"/>
+            <wp:cNvGraphicFramePr>
+              <a:graphicFrameLocks noChangeAspect="1"/>
+            </wp:cNvGraphicFramePr>
+            <a:graphic>
+              <a:graphicData uri="http://schemas.openxmlformats.org/drawingml/2006/picture">
+                <pic:pic>
+                  <pic:nvPicPr>
+                    <pic:cNvPr id="0" name="10.png"/>
+                    <pic:cNvPicPr/>
+                  </pic:nvPicPr>
+                  <pic:blipFill>
+                    <a:blip r:embed="rId21"/>
+                    <a:stretch>
+                      <a:fillRect/>
+                    </a:stretch>
+                  </pic:blipFill>
+                  <pic:spPr>
+                    <a:xfrm>
+                      <a:off x="0" y="0"/>
+                      <a:ext cx="5486400" cy="5884506"/>
+                    </a:xfrm>
+                    <a:prstGeom prst="rect"/>
+                  </pic:spPr>
+                </pic:pic>
+              </a:graphicData>
+            </a:graphic>
+          </wp:inline>
+        </w:drawing>
       </w:r>
     </w:p>
     <w:p>
@@ -3414,12 +3997,7 @@
         <w:pStyle w:val="ListBullet"/>
       </w:pPr>
       <w:r>
-        <w:t>Django organiza una aplicación web separando datos, procesamiento y</w:t>
-      </w:r>
-    </w:p>
-    <w:p>
-      <w:r>
-        <w:t>presentación, y esa separación se mantiene igual exista o no una base de datos detrás.</w:t>
+        <w:t>Django organiza una aplicación web separando datos, procesamiento y presentación, y esa separación se mantiene igual exista o no una base de datos detrás.</w:t>
       </w:r>
     </w:p>
     <w:p>
@@ -3427,12 +4005,7 @@
         <w:pStyle w:val="ListBullet"/>
       </w:pPr>
       <w:r>
-        <w:t>Una App nueva se conecta a un proyecto existente solo con registrarse en la</w:t>
-      </w:r>
-    </w:p>
-    <w:p>
-      <w:r>
-        <w:t>configuración y engancharse al archivo de rutas del proyecto; a partir de ahí convive con las demás Apps sin depender de ellas.</w:t>
+        <w:t>Una App nueva se conecta a un proyecto existente solo con registrarse en la configuración y engancharse al archivo de rutas del proyecto; a partir de ahí convive con las demás Apps sin depender de ellas.</w:t>
       </w:r>
     </w:p>
     <w:p>
@@ -3440,12 +4013,7 @@
         <w:pStyle w:val="ListBullet"/>
       </w:pPr>
       <w:r>
-        <w:t>Un formulario es el punto donde un requisito escrito en palabras se vuelve una</w:t>
-      </w:r>
-    </w:p>
-    <w:p>
-      <w:r>
-        <w:t>funcionalidad real: captura datos, los valida y los transforma en una respuesta para la persona.</w:t>
+        <w:t>Un formulario es el punto donde un requisito escrito en palabras se vuelve una funcionalidad real: captura datos, los valida y los transforma en una respuesta para la persona.</w:t>
       </w:r>
     </w:p>
     <w:p>
@@ -3453,12 +4021,7 @@
         <w:pStyle w:val="ListBullet"/>
       </w:pPr>
       <w:r>
-        <w:t>Guardar los datos solo en memoria sirve para entender el flujo completo sin la</w:t>
-      </w:r>
-    </w:p>
-    <w:p>
-      <w:r>
-        <w:t>complejidad de las migraciones, a cambio de que todo lo agregado se pierda al reiniciar el servidor.</w:t>
+        <w:t>Guardar los datos solo en memoria sirve para entender el flujo completo sin la complejidad de las migraciones, a cambio de que todo lo agregado se pierda al reiniciar el servidor.</w:t>
       </w:r>
     </w:p>
     <w:p>
@@ -3466,12 +4029,7 @@
         <w:pStyle w:val="ListBullet"/>
       </w:pPr>
       <w:r>
-        <w:t>El recorrido de cada pedido es siempre el mismo: dirección, ruta, vista,</w:t>
-      </w:r>
-    </w:p>
-    <w:p>
-      <w:r>
-        <w:t>datos, plantilla y respuesta.</w:t>
+        <w:t>El recorrido de cada pedido es siempre el mismo: dirección, ruta, vista, datos, plantilla y respuesta.</w:t>
       </w:r>
     </w:p>
     <w:p>
@@ -4130,6 +4688,60 @@
         <w:br/>
         <w:t xml:space="preserve">    &lt;title&gt;{% block title %}Veterinaria{% endblock %}&lt;/title&gt;</w:t>
         <w:br/>
+        <w:t xml:space="preserve">    &lt;style&gt;</w:t>
+        <w:br/>
+        <w:t xml:space="preserve">        * { box-sizing: border-box; }</w:t>
+        <w:br/>
+        <w:t xml:space="preserve">        body { font-family: -apple-system, "Segoe UI", Roboto, Arial, sans-serif;</w:t>
+        <w:br/>
+        <w:t xml:space="preserve">               margin: 0; color: #1f2937; background: #f3f4f6; }</w:t>
+        <w:br/>
+        <w:t xml:space="preserve">        header { background: #1f3b57; color: #fff; padding: 16px 32px; }</w:t>
+        <w:br/>
+        <w:t xml:space="preserve">        header h1 { margin: 0 0 8px; font-size: 20px; }</w:t>
+        <w:br/>
+        <w:t xml:space="preserve">        nav a { color: #cfe2ff; text-decoration: none; margin-right: 16px; font-size: 14px; }</w:t>
+        <w:br/>
+        <w:t xml:space="preserve">        nav a:hover { text-decoration: underline; }</w:t>
+        <w:br/>
+        <w:t xml:space="preserve">        main { max-width: 860px; margin: 24px auto; padding: 0 32px; }</w:t>
+        <w:br/>
+        <w:t xml:space="preserve">        h2 { font-size: 18px; }</w:t>
+        <w:br/>
+        <w:t xml:space="preserve">        table { border-collapse: collapse; width: 100%; background: #fff;</w:t>
+        <w:br/>
+        <w:t xml:space="preserve">                box-shadow: 0 1px 2px rgba(0,0,0,.08); }</w:t>
+        <w:br/>
+        <w:t xml:space="preserve">        th, td { border: 1px solid #e5e7eb; padding: 8px 12px; text-align: left; font-size: 14px; }</w:t>
+        <w:br/>
+        <w:t xml:space="preserve">        th { background: #1f3b57; color: #fff; }</w:t>
+        <w:br/>
+        <w:t xml:space="preserve">        tbody tr:nth-child(even) { background: #f9fafb; }</w:t>
+        <w:br/>
+        <w:t xml:space="preserve">        .messages { list-style: none; padding: 12px 16px; margin: 0 0 20px;</w:t>
+        <w:br/>
+        <w:t xml:space="preserve">                    background: #ecfdf5; border: 1px solid #a7f3d0; border-radius: 6px;</w:t>
+        <w:br/>
+        <w:t xml:space="preserve">                    color: #065f46; font-size: 14px; }</w:t>
+        <w:br/>
+        <w:t xml:space="preserve">        form p { margin: 12px 0; }</w:t>
+        <w:br/>
+        <w:t xml:space="preserve">        form label { display: block; font-size: 14px; font-weight: 600; margin-bottom: 4px; }</w:t>
+        <w:br/>
+        <w:t xml:space="preserve">        form input, form select { padding: 6px 8px; font-size: 14px; border: 1px solid #cbd5e1;</w:t>
+        <w:br/>
+        <w:t xml:space="preserve">                                  border-radius: 4px; min-width: 260px; }</w:t>
+        <w:br/>
+        <w:t xml:space="preserve">        button { background: #1f3b57; color: #fff; border: 0; padding: 9px 18px;</w:t>
+        <w:br/>
+        <w:t xml:space="preserve">                 border-radius: 4px; font-size: 14px; cursor: pointer; margin-right: 12px; }</w:t>
+        <w:br/>
+        <w:t xml:space="preserve">        .errorlist { color: #b91c1c; font-size: 13px; list-style: none; padding: 0; margin: 4px 0; }</w:t>
+        <w:br/>
+        <w:t xml:space="preserve">        footer { max-width: 860px; margin: 32px auto; padding: 16px 32px; color: #6b7280; font-size: 13px; }</w:t>
+        <w:br/>
+        <w:t xml:space="preserve">    &lt;/style&gt;</w:t>
+        <w:br/>
         <w:t>&lt;/head&gt;</w:t>
         <w:br/>
         <w:t>&lt;body&gt;</w:t>
@@ -4153,7 +4765,7 @@
         <w:br/>
         <w:t xml:space="preserve">        {% if messages %}</w:t>
         <w:br/>
-        <w:t xml:space="preserve">        &lt;ul&gt;</w:t>
+        <w:t xml:space="preserve">        &lt;ul class="messages"&gt;</w:t>
         <w:br/>
         <w:t xml:space="preserve">            {% for message in messages %}</w:t>
         <w:br/>
@@ -4557,12 +5169,7 @@
         <w:t>cita_crear</w:t>
       </w:r>
       <w:r>
-        <w:t>: valida, agrega la cita a la lista en memoria y</w:t>
-      </w:r>
-    </w:p>
-    <w:p>
-      <w:r>
-        <w:t xml:space="preserve">redirige al listado. </w:t>
+        <w:t xml:space="preserve">: valida, agrega la cita a la lista en memoria y redirige al listado. </w:t>
       </w:r>
       <w:r>
         <w:rPr>

</xml_diff>